<commit_message>
Strengthen design rationale and discussion in report chapters 3 and 5
</commit_message>
<xml_diff>
--- a/reports/revised_main/Bao_cao_TPOUR_TRPO_cap_nhat_Kaggle_retention.docx
+++ b/reports/revised_main/Bao_cao_TPOUR_TRPO_cap_nhat_Kaggle_retention.docx
@@ -738,6 +738,11 @@
     </w:p>
     <w:p>
       <w:r>
+        <w:t xml:space="preserve">  3.8. Lập luận thiết kế; 3.9. Thuật toán; 3.10. Đóng góp và tái lập</w:t>
+      </w:r>
+    </w:p>
+    <w:p>
+      <w:r>
         <w:t>CHƯƠNG 4. THỰC NGHIỆM, KẾT QUẢ VÀ ĐÁNH ĐỔI</w:t>
       </w:r>
     </w:p>
@@ -759,6 +764,21 @@
     <w:p>
       <w:r>
         <w:t>CHƯƠNG 5. KẾT LUẬN VÀ HƯỚNG PHÁT TRIỂN</w:t>
+      </w:r>
+    </w:p>
+    <w:p>
+      <w:r>
+        <w:t xml:space="preserve">  5.1–5.3. Công việc, hướng mở và đối chiếu mục tiêu</w:t>
+      </w:r>
+    </w:p>
+    <w:p>
+      <w:r>
+        <w:t xml:space="preserve">  5.4–5.6. Ý nghĩa, rào cản và kế hoạch kiểm chứng</w:t>
+      </w:r>
+    </w:p>
+    <w:p>
+      <w:r>
+        <w:t xml:space="preserve">  5.7. Các câu hỏi trọng tâm khi bảo vệ đồ án</w:t>
       </w:r>
     </w:p>
     <w:p>
@@ -5200,6 +5220,606 @@
     <w:p/>
     <w:p>
       <w:pPr>
+        <w:pStyle w:val="Heading2"/>
+      </w:pPr>
+      <w:r>
+        <w:t>3.8. Lập luận thiết kế: từ vấn đề quan sát đến giả thuyết kiểm chứng</w:t>
+      </w:r>
+    </w:p>
+    <w:p>
+      <w:r>
+        <w:t>Thiết kế retention xuất phát từ việc fine-tune trên mẫu Wikipedia nhỏ làm giảm SciFact so với Contriever khởi tạo. Đây là dấu hiệu suy giảm trên một benchmark tổng quát; chưa đủ để kết luận cơ chế duy nhất là catastrophic forgetting. Thay đổi miền dữ liệu, nhãn mined và cấu hình tối ưu đều có thể góp phần. Nhóm đặt giả thuyết hẹp: ràng buộc student gần hành vi ban đầu có thể giữ được một phần năng lực truy xuất tổng quát trong khi vẫn học CE/TRPO.</w:t>
+      </w:r>
+    </w:p>
+    <w:tbl>
+      <w:tblPr>
+        <w:tblStyle w:val="TableGrid"/>
+        <w:tblW w:type="auto" w:w="0"/>
+        <w:tblLook w:firstColumn="1" w:firstRow="1" w:lastColumn="0" w:lastRow="0" w:noHBand="0" w:noVBand="1" w:val="04A0"/>
+      </w:tblPr>
+      <w:tblGrid>
+        <w:gridCol w:w="4677"/>
+        <w:gridCol w:w="4677"/>
+      </w:tblGrid>
+      <w:tr>
+        <w:trPr>
+          <w:tblHeader/>
+          <w:cantSplit/>
+        </w:trPr>
+        <w:tc>
+          <w:tcPr>
+            <w:tcW w:type="dxa" w:w="4677"/>
+          </w:tcPr>
+          <w:p>
+            <w:pPr>
+              <w:keepNext/>
+            </w:pPr>
+            <w:r>
+              <w:rPr>
+                <w:rFonts w:ascii="Times New Roman" w:hAnsi="Times New Roman"/>
+                <w:sz w:val="21"/>
+              </w:rPr>
+              <w:t>Quyết định</w:t>
+            </w:r>
+          </w:p>
+        </w:tc>
+        <w:tc>
+          <w:tcPr>
+            <w:tcW w:type="dxa" w:w="4677"/>
+          </w:tcPr>
+          <w:p>
+            <w:pPr>
+              <w:keepNext/>
+            </w:pPr>
+            <w:r>
+              <w:rPr>
+                <w:rFonts w:ascii="Times New Roman" w:hAnsi="Times New Roman"/>
+                <w:sz w:val="21"/>
+              </w:rPr>
+              <w:t>Lý do và hệ quả cần kiểm tra</w:t>
+            </w:r>
+          </w:p>
+        </w:tc>
+      </w:tr>
+      <w:tr>
+        <w:trPr>
+          <w:cantSplit/>
+        </w:trPr>
+        <w:tc>
+          <w:tcPr>
+            <w:tcW w:type="dxa" w:w="4677"/>
+          </w:tcPr>
+          <w:p>
+            <w:pPr>
+              <w:keepNext/>
+            </w:pPr>
+            <w:r>
+              <w:rPr>
+                <w:rFonts w:ascii="Times New Roman" w:hAnsi="Times New Roman"/>
+                <w:sz w:val="21"/>
+              </w:rPr>
+              <w:t>Teacher cố định, tách EMA reference</w:t>
+            </w:r>
+          </w:p>
+        </w:tc>
+        <w:tc>
+          <w:tcPr>
+            <w:tcW w:type="dxa" w:w="4677"/>
+          </w:tcPr>
+          <w:p>
+            <w:pPr>
+              <w:keepNext/>
+            </w:pPr>
+            <w:r>
+              <w:rPr>
+                <w:rFonts w:ascii="Times New Roman" w:hAnsi="Times New Roman"/>
+                <w:sz w:val="21"/>
+              </w:rPr>
+              <w:t>EMA đi theo student nên không còn là mốc hành vi ban đầu. Teacher cố định tạo mốc giữ kiến thức, nhưng cũng có thể cản học thông tin mới.</w:t>
+            </w:r>
+          </w:p>
+        </w:tc>
+      </w:tr>
+      <w:tr>
+        <w:trPr>
+          <w:cantSplit/>
+        </w:trPr>
+        <w:tc>
+          <w:tcPr>
+            <w:tcW w:type="dxa" w:w="4677"/>
+          </w:tcPr>
+          <w:p>
+            <w:pPr>
+              <w:keepNext/>
+            </w:pPr>
+            <w:r>
+              <w:rPr>
+                <w:rFonts w:ascii="Times New Roman" w:hAnsi="Times New Roman"/>
+                <w:sz w:val="21"/>
+              </w:rPr>
+              <w:t>KL trên thứ tự tương đối của batch</w:t>
+            </w:r>
+          </w:p>
+        </w:tc>
+        <w:tc>
+          <w:tcPr>
+            <w:tcW w:type="dxa" w:w="4677"/>
+          </w:tcPr>
+          <w:p>
+            <w:pPr>
+              <w:keepNext/>
+            </w:pPr>
+            <w:r>
+              <w:rPr>
+                <w:rFonts w:ascii="Times New Roman" w:hAnsi="Times New Roman"/>
+                <w:sz w:val="21"/>
+              </w:rPr>
+              <w:t>Giữ phân bố ưu tiên mềm thay vì chỉ ép một tài liệu đúng. Candidate set nhỏ và phụ thuộc batch, chưa đại diện toàn corpus.</w:t>
+            </w:r>
+          </w:p>
+        </w:tc>
+      </w:tr>
+      <w:tr>
+        <w:trPr>
+          <w:cantSplit/>
+        </w:trPr>
+        <w:tc>
+          <w:tcPr>
+            <w:tcW w:type="dxa" w:w="4677"/>
+          </w:tcPr>
+          <w:p>
+            <w:pPr>
+              <w:keepNext/>
+            </w:pPr>
+            <w:r>
+              <w:rPr>
+                <w:rFonts w:ascii="Times New Roman" w:hAnsi="Times New Roman"/>
+                <w:sz w:val="21"/>
+              </w:rPr>
+              <w:t>Cosine cho distillation, dot cho retrieval</w:t>
+            </w:r>
+          </w:p>
+        </w:tc>
+        <w:tc>
+          <w:tcPr>
+            <w:tcW w:type="dxa" w:w="4677"/>
+          </w:tcPr>
+          <w:p>
+            <w:pPr>
+              <w:keepNext/>
+            </w:pPr>
+            <w:r>
+              <w:rPr>
+                <w:rFonts w:ascii="Times New Roman" w:hAnsi="Times New Roman"/>
+                <w:sz w:val="21"/>
+              </w:rPr>
+              <w:t>Cosine giảm nhạy với scale khi tạo phân bố; dot giữ protocol Contriever. Hai không đồng nhất, nên cần đo retrieval thực và thử thành phần giữ biểu diễn.</w:t>
+            </w:r>
+          </w:p>
+        </w:tc>
+      </w:tr>
+      <w:tr>
+        <w:trPr>
+          <w:cantSplit/>
+        </w:trPr>
+        <w:tc>
+          <w:tcPr>
+            <w:tcW w:type="dxa" w:w="4677"/>
+          </w:tcPr>
+          <w:p>
+            <w:pPr>
+              <w:keepNext/>
+            </w:pPr>
+            <w:r>
+              <w:rPr>
+                <w:rFonts w:ascii="Times New Roman" w:hAnsi="Times New Roman"/>
+                <w:sz w:val="21"/>
+              </w:rPr>
+              <w:t>Relative MSE bổ sung</w:t>
+            </w:r>
+          </w:p>
+        </w:tc>
+        <w:tc>
+          <w:tcPr>
+            <w:tcW w:type="dxa" w:w="4677"/>
+          </w:tcPr>
+          <w:p>
+            <w:pPr>
+              <w:keepNext/>
+            </w:pPr>
+            <w:r>
+              <w:rPr>
+                <w:rFonts w:ascii="Times New Roman" w:hAnsi="Times New Roman"/>
+                <w:sz w:val="21"/>
+              </w:rPr>
+              <w:t>Ràng buộc cả hướng và norm; chia norm teacher giúp so lỗi tương đối. Hiệu quả riêng phải kiểm tra bằng ablation, không suy ra từ ý nghĩa công thức.</w:t>
+            </w:r>
+          </w:p>
+        </w:tc>
+      </w:tr>
+      <w:tr>
+        <w:trPr>
+          <w:cantSplit/>
+        </w:trPr>
+        <w:tc>
+          <w:tcPr>
+            <w:tcW w:type="dxa" w:w="4677"/>
+          </w:tcPr>
+          <w:p>
+            <w:r>
+              <w:rPr>
+                <w:rFonts w:ascii="Times New Roman" w:hAnsi="Times New Roman"/>
+                <w:sz w:val="21"/>
+              </w:rPr>
+              <w:t>Inference chỉ dùng student</w:t>
+            </w:r>
+          </w:p>
+        </w:tc>
+        <w:tc>
+          <w:tcPr>
+            <w:tcW w:type="dxa" w:w="4677"/>
+          </w:tcPr>
+          <w:p>
+            <w:r>
+              <w:rPr>
+                <w:rFonts w:ascii="Times New Roman" w:hAnsi="Times New Roman"/>
+                <w:sz w:val="21"/>
+              </w:rPr>
+              <w:t>Có thể dùng cùng quy trình lập chỉ mục như đối chứng; phần teacher làm tăng chi phí train, không thêm một lượt teacher khi trả lời query.</w:t>
+            </w:r>
+          </w:p>
+        </w:tc>
+      </w:tr>
+    </w:tbl>
+    <w:p/>
+    <w:p>
+      <w:r>
+        <w:t>Từ giả thuyết này, thí nghiệm phải có ba góc nhìn: SciFact đo retrieval tổng quát; held-out preference theo dõi mục tiêu mined; ablation phân biệt tác động của KL và MSE. Nếu chỉ SciFact tăng mà preference giảm, kết quả được diễn giải là đánh đổi giữa hai mục tiêu. Thiết kế không mặc định retention sẽ tốt ở mọi mốc hoặc mọi miền dữ liệu.</w:t>
+      </w:r>
+    </w:p>
+    <w:p>
+      <w:pPr>
+        <w:pStyle w:val="Heading2"/>
+      </w:pPr>
+      <w:r>
+        <w:t>3.9. Thuật toán một bước huấn luyện và luồng suy luận</w:t>
+      </w:r>
+    </w:p>
+    <w:p>
+      <w:r>
+        <w:t>Bước 1 — Đọc batch bộ ba từ train split cố định, tạo augmentation và tokenize tối đa 256 token. Cùng văn bản đã augmentation được đưa cho student và teacher để tránh distillation hai đầu vào khác nhau.</w:t>
+      </w:r>
+    </w:p>
+    <w:p>
+      <w:r>
+        <w:t>Bước 2 — Student tạo embedding query, preferred và rejected có gradient. Reference tạo biểu diễn phục vụ preference gap và keys không gradient; teacher tạo mục tiêu distillation không gradient.</w:t>
+      </w:r>
+    </w:p>
+    <w:p>
+      <w:r>
+        <w:t>Bước 3 — Tính CE bằng positive và negative queue; tính TRPO theo chênh lệch student/reference. Với biến thể mới, ghép 2B tài liệu preferred/rejected của batch cho mỗi query để tính KL; tính relative MSE trên cả ba nhóm embedding.</w:t>
+      </w:r>
+    </w:p>
+    <w:p>
+      <w:r>
+        <w:t>Bước 4 — Cộng objective theo Công thức 9, backward bằng AMP, unscale gradient, kiểm tra hữu hạn và clip. Nếu bước không hợp lệ thì bỏ cập nhật; nếu hợp lệ mới cập nhật optimizer, scheduler, EMA reference và queue.</w:t>
+      </w:r>
+    </w:p>
+    <w:p>
+      <w:r>
+        <w:t>Bước 5 — Lưu log, cấu hình và checkpoint. Đánh giá với model cuối theo protocol cố định; không duyệt các checkpoint theo điểm test để chọn kết quả cao nhất.</w:t>
+      </w:r>
+    </w:p>
+    <w:p>
+      <w:r>
+        <w:t>Ví dụ batch size B=4 tạo 8 candidate documents cho mỗi query khi distillation, tức ma trận score 4×8. Đây là các mẫu trong batch, không phải 8 tài liệu do qrels SciFact chọn. Qrels test chỉ được dùng ở bước đánh giá; không dùng làm nhãn train. Reference keys đưa vào queue và candidate list distillation có vai trò khác nhau, không nên đồng nhất hai cấu trúc.</w:t>
+      </w:r>
+    </w:p>
+    <w:p>
+      <w:r>
+        <w:t>Luồng inference: tải encoder.pt của student → kiểm tra hash/protocol cache → mã hóa corpus hoặc dùng index tương thích → mã hóa query mới → tính dot product với toàn corpus → lấy top-k và lưu JSON. Trong demo replay, thay bước mã hóa bằng việc đọc run.json đã đánh giá; hai chế độ được ghi rõ để tránh trình bày kết quả lưu sẵn như một lần chạy mới.</w:t>
+      </w:r>
+    </w:p>
+    <w:p>
+      <w:pPr>
+        <w:pStyle w:val="Heading2"/>
+      </w:pPr>
+      <w:r>
+        <w:t>3.10. Phân định đóng góp và khả năng tái lập</w:t>
+      </w:r>
+    </w:p>
+    <w:tbl>
+      <w:tblPr>
+        <w:tblStyle w:val="TableGrid"/>
+        <w:tblW w:type="auto" w:w="0"/>
+        <w:tblLook w:firstColumn="1" w:firstRow="1" w:lastColumn="0" w:lastRow="0" w:noHBand="0" w:noVBand="1" w:val="04A0"/>
+      </w:tblPr>
+      <w:tblGrid>
+        <w:gridCol w:w="3118"/>
+        <w:gridCol w:w="3118"/>
+        <w:gridCol w:w="3118"/>
+      </w:tblGrid>
+      <w:tr>
+        <w:trPr>
+          <w:tblHeader/>
+          <w:cantSplit/>
+        </w:trPr>
+        <w:tc>
+          <w:tcPr>
+            <w:tcW w:type="dxa" w:w="3118"/>
+          </w:tcPr>
+          <w:p>
+            <w:pPr>
+              <w:keepNext/>
+            </w:pPr>
+            <w:r>
+              <w:rPr>
+                <w:rFonts w:ascii="Times New Roman" w:hAnsi="Times New Roman"/>
+                <w:sz w:val="21"/>
+              </w:rPr>
+              <w:t>Lớp công việc</w:t>
+            </w:r>
+          </w:p>
+        </w:tc>
+        <w:tc>
+          <w:tcPr>
+            <w:tcW w:type="dxa" w:w="3118"/>
+          </w:tcPr>
+          <w:p>
+            <w:pPr>
+              <w:keepNext/>
+            </w:pPr>
+            <w:r>
+              <w:rPr>
+                <w:rFonts w:ascii="Times New Roman" w:hAnsi="Times New Roman"/>
+                <w:sz w:val="21"/>
+              </w:rPr>
+              <w:t>Đã thực hiện</w:t>
+            </w:r>
+          </w:p>
+        </w:tc>
+        <w:tc>
+          <w:tcPr>
+            <w:tcW w:type="dxa" w:w="3118"/>
+          </w:tcPr>
+          <w:p>
+            <w:pPr>
+              <w:keepNext/>
+            </w:pPr>
+            <w:r>
+              <w:rPr>
+                <w:rFonts w:ascii="Times New Roman" w:hAnsi="Times New Roman"/>
+                <w:sz w:val="21"/>
+              </w:rPr>
+              <w:t>Phạm vi chưa bao phủ</w:t>
+            </w:r>
+          </w:p>
+        </w:tc>
+      </w:tr>
+      <w:tr>
+        <w:trPr>
+          <w:cantSplit/>
+        </w:trPr>
+        <w:tc>
+          <w:tcPr>
+            <w:tcW w:type="dxa" w:w="3118"/>
+          </w:tcPr>
+          <w:p>
+            <w:pPr>
+              <w:keepNext/>
+            </w:pPr>
+            <w:r>
+              <w:rPr>
+                <w:rFonts w:ascii="Times New Roman" w:hAnsi="Times New Roman"/>
+                <w:sz w:val="21"/>
+              </w:rPr>
+              <w:t>Kế thừa công trình gốc</w:t>
+            </w:r>
+          </w:p>
+        </w:tc>
+        <w:tc>
+          <w:tcPr>
+            <w:tcW w:type="dxa" w:w="3118"/>
+          </w:tcPr>
+          <w:p>
+            <w:pPr>
+              <w:keepNext/>
+            </w:pPr>
+            <w:r>
+              <w:rPr>
+                <w:rFonts w:ascii="Times New Roman" w:hAnsi="Times New Roman"/>
+                <w:sz w:val="21"/>
+              </w:rPr>
+              <w:t>Contriever, ý tưởng temporal preference, CE/TRPO, reference và queue</w:t>
+            </w:r>
+          </w:p>
+        </w:tc>
+        <w:tc>
+          <w:tcPr>
+            <w:tcW w:type="dxa" w:w="3118"/>
+          </w:tcPr>
+          <w:p>
+            <w:pPr>
+              <w:keepNext/>
+            </w:pPr>
+            <w:r>
+              <w:rPr>
+                <w:rFonts w:ascii="Times New Roman" w:hAnsi="Times New Roman"/>
+                <w:sz w:val="21"/>
+              </w:rPr>
+              <w:t>Chưa tái lập toàn bộ dữ liệu, lịch train và temporal QA của tác giả</w:t>
+            </w:r>
+          </w:p>
+        </w:tc>
+      </w:tr>
+      <w:tr>
+        <w:trPr>
+          <w:cantSplit/>
+        </w:trPr>
+        <w:tc>
+          <w:tcPr>
+            <w:tcW w:type="dxa" w:w="3118"/>
+          </w:tcPr>
+          <w:p>
+            <w:pPr>
+              <w:keepNext/>
+            </w:pPr>
+            <w:r>
+              <w:rPr>
+                <w:rFonts w:ascii="Times New Roman" w:hAnsi="Times New Roman"/>
+                <w:sz w:val="21"/>
+              </w:rPr>
+              <w:t>Kỹ thuật thực nghiệm của nhóm</w:t>
+            </w:r>
+          </w:p>
+        </w:tc>
+        <w:tc>
+          <w:tcPr>
+            <w:tcW w:type="dxa" w:w="3118"/>
+          </w:tcPr>
+          <w:p>
+            <w:pPr>
+              <w:keepNext/>
+            </w:pPr>
+            <w:r>
+              <w:rPr>
+                <w:rFonts w:ascii="Times New Roman" w:hAnsi="Times New Roman"/>
+                <w:sz w:val="21"/>
+              </w:rPr>
+              <w:t>Làm sạch/split, runner, provenance, kiểm thử, metrics và demo checkpoint</w:t>
+            </w:r>
+          </w:p>
+        </w:tc>
+        <w:tc>
+          <w:tcPr>
+            <w:tcW w:type="dxa" w:w="3118"/>
+          </w:tcPr>
+          <w:p>
+            <w:pPr>
+              <w:keepNext/>
+            </w:pPr>
+            <w:r>
+              <w:rPr>
+                <w:rFonts w:ascii="Times New Roman" w:hAnsi="Times New Roman"/>
+                <w:sz w:val="21"/>
+              </w:rPr>
+              <w:t>Chưa bảo đảm loại trùng ngữ nghĩa hoặc tái lập bitwise trên mọi phần cứng</w:t>
+            </w:r>
+          </w:p>
+        </w:tc>
+      </w:tr>
+      <w:tr>
+        <w:trPr>
+          <w:cantSplit/>
+        </w:trPr>
+        <w:tc>
+          <w:tcPr>
+            <w:tcW w:type="dxa" w:w="3118"/>
+          </w:tcPr>
+          <w:p>
+            <w:pPr>
+              <w:keepNext/>
+            </w:pPr>
+            <w:r>
+              <w:rPr>
+                <w:rFonts w:ascii="Times New Roman" w:hAnsi="Times New Roman"/>
+                <w:sz w:val="21"/>
+              </w:rPr>
+              <w:t>Biến thể phương pháp của nhóm</w:t>
+            </w:r>
+          </w:p>
+        </w:tc>
+        <w:tc>
+          <w:tcPr>
+            <w:tcW w:type="dxa" w:w="3118"/>
+          </w:tcPr>
+          <w:p>
+            <w:pPr>
+              <w:keepNext/>
+            </w:pPr>
+            <w:r>
+              <w:rPr>
+                <w:rFonts w:ascii="Times New Roman" w:hAnsi="Times New Roman"/>
+                <w:sz w:val="21"/>
+              </w:rPr>
+              <w:t>Teacher cố định và objective KL + relative MSE, có ablation</w:t>
+            </w:r>
+          </w:p>
+        </w:tc>
+        <w:tc>
+          <w:tcPr>
+            <w:tcW w:type="dxa" w:w="3118"/>
+          </w:tcPr>
+          <w:p>
+            <w:pPr>
+              <w:keepNext/>
+            </w:pPr>
+            <w:r>
+              <w:rPr>
+                <w:rFonts w:ascii="Times New Roman" w:hAnsi="Times New Roman"/>
+                <w:sz w:val="21"/>
+              </w:rPr>
+              <w:t>Chưa chứng minh tính mới học thuật; MSE chưa có lợi ích riêng chắc chắn</w:t>
+            </w:r>
+          </w:p>
+        </w:tc>
+      </w:tr>
+      <w:tr>
+        <w:trPr>
+          <w:cantSplit/>
+        </w:trPr>
+        <w:tc>
+          <w:tcPr>
+            <w:tcW w:type="dxa" w:w="3118"/>
+          </w:tcPr>
+          <w:p>
+            <w:r>
+              <w:rPr>
+                <w:rFonts w:ascii="Times New Roman" w:hAnsi="Times New Roman"/>
+                <w:sz w:val="21"/>
+              </w:rPr>
+              <w:t>Bằng chứng đánh giá</w:t>
+            </w:r>
+          </w:p>
+        </w:tc>
+        <w:tc>
+          <w:tcPr>
+            <w:tcW w:type="dxa" w:w="3118"/>
+          </w:tcPr>
+          <w:p>
+            <w:r>
+              <w:rPr>
+                <w:rFonts w:ascii="Times New Roman" w:hAnsi="Times New Roman"/>
+                <w:sz w:val="21"/>
+              </w:rPr>
+              <w:t>Full SciFact, ba seed, bootstrap query-level, proxy và chi phí</w:t>
+            </w:r>
+          </w:p>
+        </w:tc>
+        <w:tc>
+          <w:tcPr>
+            <w:tcW w:type="dxa" w:w="3118"/>
+          </w:tcPr>
+          <w:p>
+            <w:r>
+              <w:rPr>
+                <w:rFonts w:ascii="Times New Roman" w:hAnsi="Times New Roman"/>
+                <w:sz w:val="21"/>
+              </w:rPr>
+              <w:t>Chưa có benchmark độc lập chưa dùng khi thiết kế hoặc temporal gold</w:t>
+            </w:r>
+          </w:p>
+        </w:tc>
+      </w:tr>
+    </w:tbl>
+    <w:p/>
+    <w:p>
+      <w:r>
+        <w:t>Điều kiện tối thiểu để người khác kiểm tra lại là cùng dữ liệu/hash, cùng split và tokenizer/revision, cùng cấu hình objective, số cập nhật thực và quy tắc metric. Có thể kiểm tra rankings/metrics từ GitHub mà không train lại; muốn inference query mới cần tải đúng checkpoint từ Kaggle. Muốn tái huấn luyện cần GPU phù hợp và cài môi trường, không thể chỉ mở ảnh biểu đồ rồi coi là đã tái lập.</w:t>
+      </w:r>
+    </w:p>
+    <w:p>
+      <w:pPr>
         <w:pStyle w:val="Heading1"/>
         <w:pageBreakBefore/>
       </w:pPr>
@@ -8344,6 +8964,1123 @@
       </w:pPr>
       <w:r>
         <w:t>Tái lập đầy đủ temporal QA, nhiều mốc và nội suy time embedding của bản bài báo được chọn khi có dữ liệu/tài nguyên; đo chi phí lập chỉ mục theo đúng hệ thống triển khai.</w:t>
+      </w:r>
+    </w:p>
+    <w:p>
+      <w:pPr>
+        <w:pStyle w:val="Heading2"/>
+      </w:pPr>
+      <w:r>
+        <w:t>5.3. Đối chiếu mục tiêu với kết quả đạt được</w:t>
+      </w:r>
+    </w:p>
+    <w:tbl>
+      <w:tblPr>
+        <w:tblStyle w:val="TableGrid"/>
+        <w:tblW w:type="auto" w:w="0"/>
+        <w:tblLook w:firstColumn="1" w:firstRow="1" w:lastColumn="0" w:lastRow="0" w:noHBand="0" w:noVBand="1" w:val="04A0"/>
+      </w:tblPr>
+      <w:tblGrid>
+        <w:gridCol w:w="3118"/>
+        <w:gridCol w:w="3118"/>
+        <w:gridCol w:w="3118"/>
+      </w:tblGrid>
+      <w:tr>
+        <w:trPr>
+          <w:tblHeader/>
+          <w:cantSplit/>
+        </w:trPr>
+        <w:tc>
+          <w:tcPr>
+            <w:tcW w:type="dxa" w:w="3118"/>
+          </w:tcPr>
+          <w:p>
+            <w:pPr>
+              <w:keepNext/>
+            </w:pPr>
+            <w:r>
+              <w:rPr>
+                <w:rFonts w:ascii="Times New Roman" w:hAnsi="Times New Roman"/>
+                <w:sz w:val="21"/>
+              </w:rPr>
+              <w:t>Mục tiêu</w:t>
+            </w:r>
+          </w:p>
+        </w:tc>
+        <w:tc>
+          <w:tcPr>
+            <w:tcW w:type="dxa" w:w="3118"/>
+          </w:tcPr>
+          <w:p>
+            <w:pPr>
+              <w:keepNext/>
+            </w:pPr>
+            <w:r>
+              <w:rPr>
+                <w:rFonts w:ascii="Times New Roman" w:hAnsi="Times New Roman"/>
+                <w:sz w:val="21"/>
+              </w:rPr>
+              <w:t>Mức đạt và căn cứ</w:t>
+            </w:r>
+          </w:p>
+        </w:tc>
+        <w:tc>
+          <w:tcPr>
+            <w:tcW w:type="dxa" w:w="3118"/>
+          </w:tcPr>
+          <w:p>
+            <w:pPr>
+              <w:keepNext/>
+            </w:pPr>
+            <w:r>
+              <w:rPr>
+                <w:rFonts w:ascii="Times New Roman" w:hAnsi="Times New Roman"/>
+                <w:sz w:val="21"/>
+              </w:rPr>
+              <w:t>Điều chưa thể kết luận</w:t>
+            </w:r>
+          </w:p>
+        </w:tc>
+      </w:tr>
+      <w:tr>
+        <w:trPr>
+          <w:cantSplit/>
+        </w:trPr>
+        <w:tc>
+          <w:tcPr>
+            <w:tcW w:type="dxa" w:w="3118"/>
+          </w:tcPr>
+          <w:p>
+            <w:pPr>
+              <w:keepNext/>
+            </w:pPr>
+            <w:r>
+              <w:rPr>
+                <w:rFonts w:ascii="Times New Roman" w:hAnsi="Times New Roman"/>
+                <w:sz w:val="21"/>
+              </w:rPr>
+              <w:t>Hiểu/cài đặt phương pháp</w:t>
+            </w:r>
+          </w:p>
+        </w:tc>
+        <w:tc>
+          <w:tcPr>
+            <w:tcW w:type="dxa" w:w="3118"/>
+          </w:tcPr>
+          <w:p>
+            <w:pPr>
+              <w:keepNext/>
+            </w:pPr>
+            <w:r>
+              <w:rPr>
+                <w:rFonts w:ascii="Times New Roman" w:hAnsi="Times New Roman"/>
+                <w:sz w:val="21"/>
+              </w:rPr>
+              <w:t>Có bản CE/TRPO, EMA, queue và 14 kiểm tra toàn bộ pipeline</w:t>
+            </w:r>
+          </w:p>
+        </w:tc>
+        <w:tc>
+          <w:tcPr>
+            <w:tcW w:type="dxa" w:w="3118"/>
+          </w:tcPr>
+          <w:p>
+            <w:pPr>
+              <w:keepNext/>
+            </w:pPr>
+            <w:r>
+              <w:rPr>
+                <w:rFonts w:ascii="Times New Roman" w:hAnsi="Times New Roman"/>
+                <w:sz w:val="21"/>
+              </w:rPr>
+              <w:t>Không đồng nghĩa đã tái lập nguyên bài báo</w:t>
+            </w:r>
+          </w:p>
+        </w:tc>
+      </w:tr>
+      <w:tr>
+        <w:trPr>
+          <w:cantSplit/>
+        </w:trPr>
+        <w:tc>
+          <w:tcPr>
+            <w:tcW w:type="dxa" w:w="3118"/>
+          </w:tcPr>
+          <w:p>
+            <w:pPr>
+              <w:keepNext/>
+            </w:pPr>
+            <w:r>
+              <w:rPr>
+                <w:rFonts w:ascii="Times New Roman" w:hAnsi="Times New Roman"/>
+                <w:sz w:val="21"/>
+              </w:rPr>
+              <w:t>Thay dữ liệu mock</w:t>
+            </w:r>
+          </w:p>
+        </w:tc>
+        <w:tc>
+          <w:tcPr>
+            <w:tcW w:type="dxa" w:w="3118"/>
+          </w:tcPr>
+          <w:p>
+            <w:pPr>
+              <w:keepNext/>
+            </w:pPr>
+            <w:r>
+              <w:rPr>
+                <w:rFonts w:ascii="Times New Roman" w:hAnsi="Times New Roman"/>
+                <w:sz w:val="21"/>
+              </w:rPr>
+              <w:t>Có 2.992 bộ ba thật; train/held-out riêng và provenance</w:t>
+            </w:r>
+          </w:p>
+        </w:tc>
+        <w:tc>
+          <w:tcPr>
+            <w:tcW w:type="dxa" w:w="3118"/>
+          </w:tcPr>
+          <w:p>
+            <w:pPr>
+              <w:keepNext/>
+            </w:pPr>
+            <w:r>
+              <w:rPr>
+                <w:rFonts w:ascii="Times New Roman" w:hAnsi="Times New Roman"/>
+                <w:sz w:val="21"/>
+              </w:rPr>
+              <w:t>Nhãn mined chưa thành temporal gold; split chưa loại mọi trùng ngữ nghĩa</w:t>
+            </w:r>
+          </w:p>
+        </w:tc>
+      </w:tr>
+      <w:tr>
+        <w:trPr>
+          <w:cantSplit/>
+        </w:trPr>
+        <w:tc>
+          <w:tcPr>
+            <w:tcW w:type="dxa" w:w="3118"/>
+          </w:tcPr>
+          <w:p>
+            <w:pPr>
+              <w:keepNext/>
+            </w:pPr>
+            <w:r>
+              <w:rPr>
+                <w:rFonts w:ascii="Times New Roman" w:hAnsi="Times New Roman"/>
+                <w:sz w:val="21"/>
+              </w:rPr>
+              <w:t>Thử một mở rộng có code</w:t>
+            </w:r>
+          </w:p>
+        </w:tc>
+        <w:tc>
+          <w:tcPr>
+            <w:tcW w:type="dxa" w:w="3118"/>
+          </w:tcPr>
+          <w:p>
+            <w:pPr>
+              <w:keepNext/>
+            </w:pPr>
+            <w:r>
+              <w:rPr>
+                <w:rFonts w:ascii="Times New Roman" w:hAnsi="Times New Roman"/>
+                <w:sz w:val="21"/>
+              </w:rPr>
+              <w:t>Có teacher cố định, hai loss giữ kiến thức, ba seed và ablation</w:t>
+            </w:r>
+          </w:p>
+        </w:tc>
+        <w:tc>
+          <w:tcPr>
+            <w:tcW w:type="dxa" w:w="3118"/>
+          </w:tcPr>
+          <w:p>
+            <w:pPr>
+              <w:keepNext/>
+            </w:pPr>
+            <w:r>
+              <w:rPr>
+                <w:rFonts w:ascii="Times New Roman" w:hAnsi="Times New Roman"/>
+                <w:sz w:val="21"/>
+              </w:rPr>
+              <w:t>Không phải phát minh distillation; chưa chứng minh mọi thành phần cần thiết</w:t>
+            </w:r>
+          </w:p>
+        </w:tc>
+      </w:tr>
+      <w:tr>
+        <w:trPr>
+          <w:cantSplit/>
+        </w:trPr>
+        <w:tc>
+          <w:tcPr>
+            <w:tcW w:type="dxa" w:w="3118"/>
+          </w:tcPr>
+          <w:p>
+            <w:pPr>
+              <w:keepNext/>
+            </w:pPr>
+            <w:r>
+              <w:rPr>
+                <w:rFonts w:ascii="Times New Roman" w:hAnsi="Times New Roman"/>
+                <w:sz w:val="21"/>
+              </w:rPr>
+              <w:t>Cải thiện retrieval sau fine-tune</w:t>
+            </w:r>
+          </w:p>
+        </w:tc>
+        <w:tc>
+          <w:tcPr>
+            <w:tcW w:type="dxa" w:w="3118"/>
+          </w:tcPr>
+          <w:p>
+            <w:pPr>
+              <w:keepNext/>
+            </w:pPr>
+            <w:r>
+              <w:rPr>
+                <w:rFonts w:ascii="Times New Roman" w:hAnsi="Times New Roman"/>
+                <w:sz w:val="21"/>
+              </w:rPr>
+              <w:t>nDCG@10 tăng so với TRPO ở cả ba seed đã chạy</w:t>
+            </w:r>
+          </w:p>
+        </w:tc>
+        <w:tc>
+          <w:tcPr>
+            <w:tcW w:type="dxa" w:w="3118"/>
+          </w:tcPr>
+          <w:p>
+            <w:pPr>
+              <w:keepNext/>
+            </w:pPr>
+            <w:r>
+              <w:rPr>
+                <w:rFonts w:ascii="Times New Roman" w:hAnsi="Times New Roman"/>
+                <w:sz w:val="21"/>
+              </w:rPr>
+              <w:t>Chưa vượt model gốc, chưa chứng minh tổng quát sang benchmark khác</w:t>
+            </w:r>
+          </w:p>
+        </w:tc>
+      </w:tr>
+      <w:tr>
+        <w:trPr>
+          <w:cantSplit/>
+        </w:trPr>
+        <w:tc>
+          <w:tcPr>
+            <w:tcW w:type="dxa" w:w="3118"/>
+          </w:tcPr>
+          <w:p>
+            <w:r>
+              <w:rPr>
+                <w:rFonts w:ascii="Times New Roman" w:hAnsi="Times New Roman"/>
+                <w:sz w:val="21"/>
+              </w:rPr>
+              <w:t>Minh họa sử dụng thật</w:t>
+            </w:r>
+          </w:p>
+        </w:tc>
+        <w:tc>
+          <w:tcPr>
+            <w:tcW w:type="dxa" w:w="3118"/>
+          </w:tcPr>
+          <w:p>
+            <w:r>
+              <w:rPr>
+                <w:rFonts w:ascii="Times New Roman" w:hAnsi="Times New Roman"/>
+                <w:sz w:val="21"/>
+              </w:rPr>
+              <w:t>Có inference checkpoint, query mới, cache và đối chiếu top-k</w:t>
+            </w:r>
+          </w:p>
+        </w:tc>
+        <w:tc>
+          <w:tcPr>
+            <w:tcW w:type="dxa" w:w="3118"/>
+          </w:tcPr>
+          <w:p>
+            <w:r>
+              <w:rPr>
+                <w:rFonts w:ascii="Times New Roman" w:hAnsi="Times New Roman"/>
+                <w:sz w:val="21"/>
+              </w:rPr>
+              <w:t>Một query demo không chứng minh accuracy hoặc temporal correctness</w:t>
+            </w:r>
+          </w:p>
+        </w:tc>
+      </w:tr>
+    </w:tbl>
+    <w:p/>
+    <w:p>
+      <w:r>
+        <w:t>Đóng góp có giá trị nhất của đồ án là biến một minh họa thuận lợi thành thực nghiệm có đối chứng và có thể truy nguyên. Phần kỹ thuật và phần nghiên cứu cần được đánh giá riêng: pipeline hoạt động là điều kiện cần để tin số liệu; hiệu quả phương pháp phải dựa vào benchmark, độ bất định và các kết quả bất lợi. Nhóm đạt được bằng chứng cho một giả thuyết hẹp về retention, chưa đạt mục tiêu cải thiện toàn diện TPOUR.</w:t>
+      </w:r>
+    </w:p>
+    <w:p>
+      <w:pPr>
+        <w:pStyle w:val="Heading2"/>
+      </w:pPr>
+      <w:r>
+        <w:t>5.4. Ý nghĩa kết quả và những cách giải thích còn cạnh tranh</w:t>
+      </w:r>
+    </w:p>
+    <w:p>
+      <w:r>
+        <w:t>SciFact tăng cùng top-10 overlap với baseline phù hợp với cơ chế giữ hành vi teacher. Tuy nhiên, tương quan này chưa chứng minh nguyên nhân duy nhất; regularization, thay đổi quỹ đạo tối ưu hoặc nhãn train có nhiễu cũng có thể ảnh hưởng. Kết quả gợi ý cần giữ đối chứng chỉ KL, đồng thời mở rộng seed và kiểm tra benchmark khác trước khi chọn thiết kế phức tạp hơn.</w:t>
+      </w:r>
+    </w:p>
+    <w:p>
+      <w:r>
+        <w:t>Preference accuracy giảm là bằng chứng biến thể đang đánh đổi một phần mục tiêu mined để giữ retrieval tổng quát. Do nhãn chưa được thẩm định, chưa biết mức giảm phản ánh mất khả năng đúng thời gian hay chỉ không khớp proxy. Cả hai khả năng đều cần được xem xét: không thể bỏ qua proxy xấu, cũng không thể gọi proxy là chân lý về thời gian.</w:t>
+      </w:r>
+    </w:p>
+    <w:p>
+      <w:r>
+        <w:t>Việc chưa vượt Contriever gốc cho thấy fine-tune hiện tại chưa tạo lợi ích ròng trên SciFact. Với tác vụ chỉ truy xuất khoa học tổng quát, chưa có căn cứ chọn retention thay cho baseline từ số liệu này. Với tác vụ cần thời gian, cần thêm tập temporal gold để đánh giá lợi ích cập nhật so với chi phí giữ kiến thức; SciFact một mình không đủ để quyết định.</w:t>
+      </w:r>
+    </w:p>
+    <w:p>
+      <w:pPr>
+        <w:pStyle w:val="Heading2"/>
+      </w:pPr>
+      <w:r>
+        <w:t>5.5. Các rào cản còn lại và tác động đến độ tin cậy</w:t>
+      </w:r>
+    </w:p>
+    <w:tbl>
+      <w:tblPr>
+        <w:tblStyle w:val="TableGrid"/>
+        <w:tblW w:type="auto" w:w="0"/>
+        <w:tblLook w:firstColumn="1" w:firstRow="1" w:lastColumn="0" w:lastRow="0" w:noHBand="0" w:noVBand="1" w:val="04A0"/>
+      </w:tblPr>
+      <w:tblGrid>
+        <w:gridCol w:w="3118"/>
+        <w:gridCol w:w="3118"/>
+        <w:gridCol w:w="3118"/>
+      </w:tblGrid>
+      <w:tr>
+        <w:trPr>
+          <w:tblHeader/>
+          <w:cantSplit/>
+        </w:trPr>
+        <w:tc>
+          <w:tcPr>
+            <w:tcW w:type="dxa" w:w="3118"/>
+          </w:tcPr>
+          <w:p>
+            <w:r>
+              <w:rPr>
+                <w:rFonts w:ascii="Times New Roman" w:hAnsi="Times New Roman"/>
+                <w:sz w:val="21"/>
+              </w:rPr>
+              <w:t>Rào cản</w:t>
+            </w:r>
+          </w:p>
+        </w:tc>
+        <w:tc>
+          <w:tcPr>
+            <w:tcW w:type="dxa" w:w="3118"/>
+          </w:tcPr>
+          <w:p>
+            <w:r>
+              <w:rPr>
+                <w:rFonts w:ascii="Times New Roman" w:hAnsi="Times New Roman"/>
+                <w:sz w:val="21"/>
+              </w:rPr>
+              <w:t>Tác động</w:t>
+            </w:r>
+          </w:p>
+        </w:tc>
+        <w:tc>
+          <w:tcPr>
+            <w:tcW w:type="dxa" w:w="3118"/>
+          </w:tcPr>
+          <w:p>
+            <w:r>
+              <w:rPr>
+                <w:rFonts w:ascii="Times New Roman" w:hAnsi="Times New Roman"/>
+                <w:sz w:val="21"/>
+              </w:rPr>
+              <w:t>Cách xử lý cần làm tiếp</w:t>
+            </w:r>
+          </w:p>
+        </w:tc>
+      </w:tr>
+      <w:tr>
+        <w:trPr>
+          <w:cantSplit/>
+        </w:trPr>
+        <w:tc>
+          <w:tcPr>
+            <w:tcW w:type="dxa" w:w="3118"/>
+          </w:tcPr>
+          <w:p>
+            <w:r>
+              <w:rPr>
+                <w:rFonts w:ascii="Times New Roman" w:hAnsi="Times New Roman"/>
+                <w:sz w:val="21"/>
+              </w:rPr>
+              <w:t>Mẫu train nhỏ và mined labels</w:t>
+            </w:r>
+          </w:p>
+        </w:tc>
+        <w:tc>
+          <w:tcPr>
+            <w:tcW w:type="dxa" w:w="3118"/>
+          </w:tcPr>
+          <w:p>
+            <w:r>
+              <w:rPr>
+                <w:rFonts w:ascii="Times New Roman" w:hAnsi="Times New Roman"/>
+                <w:sz w:val="21"/>
+              </w:rPr>
+              <w:t>Khó khái quát; accuracy thấp có nhiều cách giải thích</w:t>
+            </w:r>
+          </w:p>
+        </w:tc>
+        <w:tc>
+          <w:tcPr>
+            <w:tcW w:type="dxa" w:w="3118"/>
+          </w:tcPr>
+          <w:p>
+            <w:r>
+              <w:rPr>
+                <w:rFonts w:ascii="Times New Roman" w:hAnsi="Times New Roman"/>
+                <w:sz w:val="21"/>
+              </w:rPr>
+              <w:t>Kiểm tra thủ công nhãn và mở rộng dữ liệu có nguồn/thời gian rõ</w:t>
+            </w:r>
+          </w:p>
+        </w:tc>
+      </w:tr>
+      <w:tr>
+        <w:trPr>
+          <w:cantSplit/>
+        </w:trPr>
+        <w:tc>
+          <w:tcPr>
+            <w:tcW w:type="dxa" w:w="3118"/>
+          </w:tcPr>
+          <w:p>
+            <w:r>
+              <w:rPr>
+                <w:rFonts w:ascii="Times New Roman" w:hAnsi="Times New Roman"/>
+                <w:sz w:val="21"/>
+              </w:rPr>
+              <w:t>Thiếu article ID và temporal gold</w:t>
+            </w:r>
+          </w:p>
+        </w:tc>
+        <w:tc>
+          <w:tcPr>
+            <w:tcW w:type="dxa" w:w="3118"/>
+          </w:tcPr>
+          <w:p>
+            <w:r>
+              <w:rPr>
+                <w:rFonts w:ascii="Times New Roman" w:hAnsi="Times New Roman"/>
+                <w:sz w:val="21"/>
+              </w:rPr>
+              <w:t>Exact-text split chưa loại mọi leakage; chưa đo đúng mốc</w:t>
+            </w:r>
+          </w:p>
+        </w:tc>
+        <w:tc>
+          <w:tcPr>
+            <w:tcW w:type="dxa" w:w="3118"/>
+          </w:tcPr>
+          <w:p>
+            <w:r>
+              <w:rPr>
+                <w:rFonts w:ascii="Times New Roman" w:hAnsi="Times New Roman"/>
+                <w:sz w:val="21"/>
+              </w:rPr>
+              <w:t>Nhóm theo article/snapshot khi có metadata; xây test thời gian được thẩm định</w:t>
+            </w:r>
+          </w:p>
+        </w:tc>
+      </w:tr>
+      <w:tr>
+        <w:trPr>
+          <w:cantSplit/>
+        </w:trPr>
+        <w:tc>
+          <w:tcPr>
+            <w:tcW w:type="dxa" w:w="3118"/>
+          </w:tcPr>
+          <w:p>
+            <w:r>
+              <w:rPr>
+                <w:rFonts w:ascii="Times New Roman" w:hAnsi="Times New Roman"/>
+                <w:sz w:val="21"/>
+              </w:rPr>
+              <w:t>Đã dùng SciFact khi thiết kế</w:t>
+            </w:r>
+          </w:p>
+        </w:tc>
+        <w:tc>
+          <w:tcPr>
+            <w:tcW w:type="dxa" w:w="3118"/>
+          </w:tcPr>
+          <w:p>
+            <w:r>
+              <w:rPr>
+                <w:rFonts w:ascii="Times New Roman" w:hAnsi="Times New Roman"/>
+                <w:sz w:val="21"/>
+              </w:rPr>
+              <w:t>Có benchmark-aware design bias dù không chọn checkpoint bằng test</w:t>
+            </w:r>
+          </w:p>
+        </w:tc>
+        <w:tc>
+          <w:tcPr>
+            <w:tcW w:type="dxa" w:w="3118"/>
+          </w:tcPr>
+          <w:p>
+            <w:r>
+              <w:rPr>
+                <w:rFonts w:ascii="Times New Roman" w:hAnsi="Times New Roman"/>
+                <w:sz w:val="21"/>
+              </w:rPr>
+              <w:t>Giữ benchmark mới chưa xem để đánh giá xác nhận</w:t>
+            </w:r>
+          </w:p>
+        </w:tc>
+      </w:tr>
+      <w:tr>
+        <w:trPr>
+          <w:cantSplit/>
+        </w:trPr>
+        <w:tc>
+          <w:tcPr>
+            <w:tcW w:type="dxa" w:w="3118"/>
+          </w:tcPr>
+          <w:p>
+            <w:r>
+              <w:rPr>
+                <w:rFonts w:ascii="Times New Roman" w:hAnsi="Times New Roman"/>
+                <w:sz w:val="21"/>
+              </w:rPr>
+              <w:t>Ba seed, ablation một seed</w:t>
+            </w:r>
+          </w:p>
+        </w:tc>
+        <w:tc>
+          <w:tcPr>
+            <w:tcW w:type="dxa" w:w="3118"/>
+          </w:tcPr>
+          <w:p>
+            <w:r>
+              <w:rPr>
+                <w:rFonts w:ascii="Times New Roman" w:hAnsi="Times New Roman"/>
+                <w:sz w:val="21"/>
+              </w:rPr>
+              <w:t>CI theo query không bao quát mọi nguồn bất định</w:t>
+            </w:r>
+          </w:p>
+        </w:tc>
+        <w:tc>
+          <w:tcPr>
+            <w:tcW w:type="dxa" w:w="3118"/>
+          </w:tcPr>
+          <w:p>
+            <w:r>
+              <w:rPr>
+                <w:rFonts w:ascii="Times New Roman" w:hAnsi="Times New Roman"/>
+                <w:sz w:val="21"/>
+              </w:rPr>
+              <w:t>Lặp nhiều seed cho mọi nhánh, báo CI/SD đúng đơn vị</w:t>
+            </w:r>
+          </w:p>
+        </w:tc>
+      </w:tr>
+      <w:tr>
+        <w:trPr>
+          <w:cantSplit/>
+        </w:trPr>
+        <w:tc>
+          <w:tcPr>
+            <w:tcW w:type="dxa" w:w="3118"/>
+          </w:tcPr>
+          <w:p>
+            <w:r>
+              <w:rPr>
+                <w:rFonts w:ascii="Times New Roman" w:hAnsi="Times New Roman"/>
+                <w:sz w:val="21"/>
+              </w:rPr>
+              <w:t>1.000 lần thử và cấu hình gọn</w:t>
+            </w:r>
+          </w:p>
+        </w:tc>
+        <w:tc>
+          <w:tcPr>
+            <w:tcW w:type="dxa" w:w="3118"/>
+          </w:tcPr>
+          <w:p>
+            <w:r>
+              <w:rPr>
+                <w:rFonts w:ascii="Times New Roman" w:hAnsi="Times New Roman"/>
+                <w:sz w:val="21"/>
+              </w:rPr>
+              <w:t>Chưa đại diện quá trình hội tụ hay cấu hình bài gốc</w:t>
+            </w:r>
+          </w:p>
+        </w:tc>
+        <w:tc>
+          <w:tcPr>
+            <w:tcW w:type="dxa" w:w="3118"/>
+          </w:tcPr>
+          <w:p>
+            <w:r>
+              <w:rPr>
+                <w:rFonts w:ascii="Times New Roman" w:hAnsi="Times New Roman"/>
+                <w:sz w:val="21"/>
+              </w:rPr>
+              <w:t>Theo dõi validation độc lập và so quy mô/lịch train có kiểm soát</w:t>
+            </w:r>
+          </w:p>
+        </w:tc>
+      </w:tr>
+      <w:tr>
+        <w:trPr>
+          <w:cantSplit/>
+        </w:trPr>
+        <w:tc>
+          <w:tcPr>
+            <w:tcW w:type="dxa" w:w="3118"/>
+          </w:tcPr>
+          <w:p>
+            <w:r>
+              <w:rPr>
+                <w:rFonts w:ascii="Times New Roman" w:hAnsi="Times New Roman"/>
+                <w:sz w:val="21"/>
+              </w:rPr>
+              <w:t>Chi phí và tái lập môi trường</w:t>
+            </w:r>
+          </w:p>
+        </w:tc>
+        <w:tc>
+          <w:tcPr>
+            <w:tcW w:type="dxa" w:w="3118"/>
+          </w:tcPr>
+          <w:p>
+            <w:r>
+              <w:rPr>
+                <w:rFonts w:ascii="Times New Roman" w:hAnsi="Times New Roman"/>
+                <w:sz w:val="21"/>
+              </w:rPr>
+              <w:t>Teacher tăng train/memory; checkpoint lớn nằm ở Kaggle</w:t>
+            </w:r>
+          </w:p>
+        </w:tc>
+        <w:tc>
+          <w:tcPr>
+            <w:tcW w:type="dxa" w:w="3118"/>
+          </w:tcPr>
+          <w:p>
+            <w:r>
+              <w:rPr>
+                <w:rFonts w:ascii="Times New Roman" w:hAnsi="Times New Roman"/>
+                <w:sz w:val="21"/>
+              </w:rPr>
+              <w:t>Lưu phiên bản/hash và hướng dẫn tải; đo chi phí end-to-end khi mở rộng</w:t>
+            </w:r>
+          </w:p>
+        </w:tc>
+      </w:tr>
+    </w:tbl>
+    <w:p/>
+    <w:p>
+      <w:r>
+        <w:t>Những rào cản này giới hạn phạm vi tuyên bố, không làm mất giá trị của toàn bộ thực nghiệm. Nhóm vẫn có thể chứng minh code chạy, số liệu có nguồn và biến thể có tác động đo được trong cấu hình cụ thể. Điều cần tránh là dùng kết quả đó để khẳng định mọi temporal retrieval đều được cải thiện hoặc mô hình không còn quên tri thức.</w:t>
+      </w:r>
+    </w:p>
+    <w:p>
+      <w:pPr>
+        <w:pStyle w:val="Heading2"/>
+      </w:pPr>
+      <w:r>
+        <w:t>5.6. Kế hoạch phát triển theo thứ tự ưu tiên và tiêu chí kiểm chứng</w:t>
+      </w:r>
+    </w:p>
+    <w:tbl>
+      <w:tblPr>
+        <w:tblStyle w:val="TableGrid"/>
+        <w:tblW w:type="auto" w:w="0"/>
+        <w:tblLook w:firstColumn="1" w:firstRow="1" w:lastColumn="0" w:lastRow="0" w:noHBand="0" w:noVBand="1" w:val="04A0"/>
+      </w:tblPr>
+      <w:tblGrid>
+        <w:gridCol w:w="3118"/>
+        <w:gridCol w:w="3118"/>
+        <w:gridCol w:w="3118"/>
+      </w:tblGrid>
+      <w:tr>
+        <w:trPr>
+          <w:tblHeader/>
+          <w:cantSplit/>
+        </w:trPr>
+        <w:tc>
+          <w:tcPr>
+            <w:tcW w:type="dxa" w:w="3118"/>
+          </w:tcPr>
+          <w:p>
+            <w:pPr>
+              <w:keepNext/>
+            </w:pPr>
+            <w:r>
+              <w:rPr>
+                <w:rFonts w:ascii="Times New Roman" w:hAnsi="Times New Roman"/>
+                <w:sz w:val="21"/>
+              </w:rPr>
+              <w:t>Ưu tiên</w:t>
+            </w:r>
+          </w:p>
+        </w:tc>
+        <w:tc>
+          <w:tcPr>
+            <w:tcW w:type="dxa" w:w="3118"/>
+          </w:tcPr>
+          <w:p>
+            <w:pPr>
+              <w:keepNext/>
+            </w:pPr>
+            <w:r>
+              <w:rPr>
+                <w:rFonts w:ascii="Times New Roman" w:hAnsi="Times New Roman"/>
+                <w:sz w:val="21"/>
+              </w:rPr>
+              <w:t>Thí nghiệm đề xuất — chưa thực hiện</w:t>
+            </w:r>
+          </w:p>
+        </w:tc>
+        <w:tc>
+          <w:tcPr>
+            <w:tcW w:type="dxa" w:w="3118"/>
+          </w:tcPr>
+          <w:p>
+            <w:pPr>
+              <w:keepNext/>
+            </w:pPr>
+            <w:r>
+              <w:rPr>
+                <w:rFonts w:ascii="Times New Roman" w:hAnsi="Times New Roman"/>
+                <w:sz w:val="21"/>
+              </w:rPr>
+              <w:t>Tiêu chí quyết định</w:t>
+            </w:r>
+          </w:p>
+        </w:tc>
+      </w:tr>
+      <w:tr>
+        <w:trPr>
+          <w:cantSplit/>
+        </w:trPr>
+        <w:tc>
+          <w:tcPr>
+            <w:tcW w:type="dxa" w:w="3118"/>
+          </w:tcPr>
+          <w:p>
+            <w:pPr>
+              <w:keepNext/>
+            </w:pPr>
+            <w:r>
+              <w:rPr>
+                <w:rFonts w:ascii="Times New Roman" w:hAnsi="Times New Roman"/>
+                <w:sz w:val="21"/>
+              </w:rPr>
+              <w:t>1. Kiểm tra mục tiêu thời gian</w:t>
+            </w:r>
+          </w:p>
+        </w:tc>
+        <w:tc>
+          <w:tcPr>
+            <w:tcW w:type="dxa" w:w="3118"/>
+          </w:tcPr>
+          <w:p>
+            <w:pPr>
+              <w:keepNext/>
+            </w:pPr>
+            <w:r>
+              <w:rPr>
+                <w:rFonts w:ascii="Times New Roman" w:hAnsi="Times New Roman"/>
+                <w:sz w:val="21"/>
+              </w:rPr>
+              <w:t>Thẩm định mẫu mined với người đọc, ghi nhãn đúng/sai/không đủ thông tin; tách train/validation/test theo nguồn và thời gian</w:t>
+            </w:r>
+          </w:p>
+        </w:tc>
+        <w:tc>
+          <w:tcPr>
+            <w:tcW w:type="dxa" w:w="3118"/>
+          </w:tcPr>
+          <w:p>
+            <w:pPr>
+              <w:keepNext/>
+            </w:pPr>
+            <w:r>
+              <w:rPr>
+                <w:rFonts w:ascii="Times New Roman" w:hAnsi="Times New Roman"/>
+                <w:sz w:val="21"/>
+              </w:rPr>
+              <w:t>Có test temporal gold độc lập, quy tắc nhãn rõ và thống kê bất đồng</w:t>
+            </w:r>
+          </w:p>
+        </w:tc>
+      </w:tr>
+      <w:tr>
+        <w:trPr>
+          <w:cantSplit/>
+        </w:trPr>
+        <w:tc>
+          <w:tcPr>
+            <w:tcW w:type="dxa" w:w="3118"/>
+          </w:tcPr>
+          <w:p>
+            <w:pPr>
+              <w:keepNext/>
+            </w:pPr>
+            <w:r>
+              <w:rPr>
+                <w:rFonts w:ascii="Times New Roman" w:hAnsi="Times New Roman"/>
+                <w:sz w:val="21"/>
+              </w:rPr>
+              <w:t>2. Xác nhận tính tổng quát</w:t>
+            </w:r>
+          </w:p>
+        </w:tc>
+        <w:tc>
+          <w:tcPr>
+            <w:tcW w:type="dxa" w:w="3118"/>
+          </w:tcPr>
+          <w:p>
+            <w:pPr>
+              <w:keepNext/>
+            </w:pPr>
+            <w:r>
+              <w:rPr>
+                <w:rFonts w:ascii="Times New Roman" w:hAnsi="Times New Roman"/>
+                <w:sz w:val="21"/>
+              </w:rPr>
+              <w:t>Cố định cấu hình trên validation; đánh giá benchmark chưa dùng khi thiết kế; lặp ablation KL và KL+MSE nhiều seed</w:t>
+            </w:r>
+          </w:p>
+        </w:tc>
+        <w:tc>
+          <w:tcPr>
+            <w:tcW w:type="dxa" w:w="3118"/>
+          </w:tcPr>
+          <w:p>
+            <w:pPr>
+              <w:keepNext/>
+            </w:pPr>
+            <w:r>
+              <w:rPr>
+                <w:rFonts w:ascii="Times New Roman" w:hAnsi="Times New Roman"/>
+                <w:sz w:val="21"/>
+              </w:rPr>
+              <w:t>Lợi ích lặp lại và báo cả kết quả giảm; không chọn tham số trên test</w:t>
+            </w:r>
+          </w:p>
+        </w:tc>
+      </w:tr>
+      <w:tr>
+        <w:trPr>
+          <w:cantSplit/>
+        </w:trPr>
+        <w:tc>
+          <w:tcPr>
+            <w:tcW w:type="dxa" w:w="3118"/>
+          </w:tcPr>
+          <w:p>
+            <w:pPr>
+              <w:keepNext/>
+            </w:pPr>
+            <w:r>
+              <w:rPr>
+                <w:rFonts w:ascii="Times New Roman" w:hAnsi="Times New Roman"/>
+                <w:sz w:val="21"/>
+              </w:rPr>
+              <w:t>3. Giảm đánh đổi retention</w:t>
+            </w:r>
+          </w:p>
+        </w:tc>
+        <w:tc>
+          <w:tcPr>
+            <w:tcW w:type="dxa" w:w="3118"/>
+          </w:tcPr>
+          <w:p>
+            <w:pPr>
+              <w:keepNext/>
+            </w:pPr>
+            <w:r>
+              <w:rPr>
+                <w:rFonts w:ascii="Times New Roman" w:hAnsi="Times New Roman"/>
+                <w:sz w:val="21"/>
+              </w:rPr>
+              <w:t>Thử trọng số retention có điều kiện khi teacher mâu thuẫn với ưu tiên mới; so gamma=0, chỉ KL và biến thể điều kiện</w:t>
+            </w:r>
+          </w:p>
+        </w:tc>
+        <w:tc>
+          <w:tcPr>
+            <w:tcW w:type="dxa" w:w="3118"/>
+          </w:tcPr>
+          <w:p>
+            <w:pPr>
+              <w:keepNext/>
+            </w:pPr>
+            <w:r>
+              <w:rPr>
+                <w:rFonts w:ascii="Times New Roman" w:hAnsi="Times New Roman"/>
+                <w:sz w:val="21"/>
+              </w:rPr>
+              <w:t>Đánh giá đồng thời temporal quality, retrieval tổng quát và chi phí; loại nếu chỉ chuyển suy giảm sang mục tiêu khác</w:t>
+            </w:r>
+          </w:p>
+        </w:tc>
+      </w:tr>
+      <w:tr>
+        <w:trPr>
+          <w:cantSplit/>
+        </w:trPr>
+        <w:tc>
+          <w:tcPr>
+            <w:tcW w:type="dxa" w:w="3118"/>
+          </w:tcPr>
+          <w:p>
+            <w:r>
+              <w:rPr>
+                <w:rFonts w:ascii="Times New Roman" w:hAnsi="Times New Roman"/>
+                <w:sz w:val="21"/>
+              </w:rPr>
+              <w:t>4. Mở rộng gần bài gốc</w:t>
+            </w:r>
+          </w:p>
+        </w:tc>
+        <w:tc>
+          <w:tcPr>
+            <w:tcW w:type="dxa" w:w="3118"/>
+          </w:tcPr>
+          <w:p>
+            <w:r>
+              <w:rPr>
+                <w:rFonts w:ascii="Times New Roman" w:hAnsi="Times New Roman"/>
+                <w:sz w:val="21"/>
+              </w:rPr>
+              <w:t>Dữ liệu nhiều snapshot, kiểm tra nội suy time embedding và lịch train dài hơn</w:t>
+            </w:r>
+          </w:p>
+        </w:tc>
+        <w:tc>
+          <w:tcPr>
+            <w:tcW w:type="dxa" w:w="3118"/>
+          </w:tcPr>
+          <w:p>
+            <w:r>
+              <w:rPr>
+                <w:rFonts w:ascii="Times New Roman" w:hAnsi="Times New Roman"/>
+                <w:sz w:val="21"/>
+              </w:rPr>
+              <w:t>Đối chiếu đúng bản PDF/protocol, báo độ lệch cấu hình và tài nguyên</w:t>
+            </w:r>
+          </w:p>
+        </w:tc>
+      </w:tr>
+    </w:tbl>
+    <w:p/>
+    <w:p>
+      <w:r>
+        <w:t>Retention có điều kiện là một giả thuyết nghiên cứu tiếp theo, chưa có kết quả trong kho hiện tại. Không nên gán trọng số bằng nhãn test hoặc quyết định theo trực giác về một query; cần định nghĩa tín hiệu tại train/validation và giữ test độc lập. Chỉ khi có lợi ích đồng thời trên hai mục tiêu và chi phí chấp nhận được mới có cơ sở nói phương pháp toàn diện hơn.</w:t>
+      </w:r>
+    </w:p>
+    <w:p>
+      <w:pPr>
+        <w:pStyle w:val="Heading2"/>
+      </w:pPr>
+      <w:r>
+        <w:t>5.7. Các câu hỏi trọng tâm khi bảo vệ đồ án</w:t>
+      </w:r>
+    </w:p>
+    <w:p>
+      <w:r>
+        <w:rPr>
+          <w:b/>
+        </w:rPr>
+        <w:t>Nhóm cải tiến gì so với việc chạy lại code?</w:t>
+      </w:r>
+    </w:p>
+    <w:p>
+      <w:r>
+        <w:t>Nhóm thêm teacher Contriever cố định và objective giữ phân bố xếp hạng/biểu diễn, rồi kiểm chứng bằng đối chứng ba seed, ablation và checkpoint thật. Runner/provenance là đóng góp kỹ thuật hỗ trợ kiểm chứng; không nên gọi riêng việc chuyển lên Kaggle là cải tiến thuật toán.</w:t>
+      </w:r>
+    </w:p>
+    <w:p>
+      <w:r>
+        <w:rPr>
+          <w:b/>
+        </w:rPr>
+        <w:t>Nếu chưa vượt baseline thì cải tiến có ý nghĩa gì?</w:t>
+      </w:r>
+    </w:p>
+    <w:p>
+      <w:r>
+        <w:t>Ý nghĩa hiện có là hạn chế mức giảm do fine-tune so với TRPO trong cùng protocol. Đây là kết quả có giới hạn; nếu chỉ cần SciFact thì baseline vẫn có điểm cao hơn. Chưa có bằng chứng để khuyên thay baseline trong mọi ứng dụng.</w:t>
+      </w:r>
+    </w:p>
+    <w:p>
+      <w:r>
+        <w:rPr>
+          <w:b/>
+        </w:rPr>
+        <w:t>Vì sao không dùng EMA reference làm teacher luôn?</w:t>
+      </w:r>
+    </w:p>
+    <w:p>
+      <w:r>
+        <w:t>EMA reference thay đổi theo student để phục vụ preference learning. Teacher cố định giữ mốc hành vi trước fine-tune. Nếu dùng chung, mục tiêu retention sẽ di chuyển theo quá trình học và không còn đúng thiết kế đã thử.</w:t>
+      </w:r>
+    </w:p>
+    <w:p>
+      <w:r>
+        <w:rPr>
+          <w:b/>
+        </w:rPr>
+        <w:t>Có chắc MSE cần thiết và mô hình tốt hơn về thời gian?</w:t>
+      </w:r>
+    </w:p>
+    <w:p>
+      <w:r>
+        <w:t>Chưa chắc cả hai. Ablation một seed có CI chứa 0; preference proxy giảm, chưa có temporal gold. Nhóm báo rõ các kết quả này thay vì kết luận mọi thành phần đều hiệu quả.</w:t>
+      </w:r>
+    </w:p>
+    <w:p>
+      <w:r>
+        <w:rPr>
+          <w:b/>
+        </w:rPr>
+        <w:t>Có tái lập đầy đủ bài báo chưa?</w:t>
+      </w:r>
+    </w:p>
+    <w:p>
+      <w:r>
+        <w:t>Chưa. Nhóm đã cài đặt bản gọn, train dữ liệu thật, đo SciFact và thử retention; chưa tái lập toàn bộ snapshot, temporal QA, time interpolation và quy mô tác giả.</w:t>
+      </w:r>
+    </w:p>
+    <w:p>
+      <w:r>
+        <w:rPr>
+          <w:b/>
+        </w:rPr>
+        <w:t>Demo chứng minh điều gì?</w:t>
+      </w:r>
+    </w:p>
+    <w:p>
+      <w:r>
+        <w:t>Demo xác nhận checkpoint thực có thể mã hóa query và truy xuất corpus, với hash/top-k đối chiếu. Chất lượng được đánh giá trên toàn test; query mới chưa có gold nên chỉ minh họa hoạt động, không phải bằng chứng accuracy.</w:t>
       </w:r>
     </w:p>
     <w:p>

</xml_diff>